<commit_message>
vault backup: 2026-02-24 16:16:32
</commit_message>
<xml_diff>
--- a/Materias/Diseño de sistemas/Material/TP1/Flujos de sucesos/CU3 - Gestionar convenios/CU - Gestionar convenios.docx
+++ b/Materias/Diseño de sistemas/Material/TP1/Flujos de sucesos/CU3 - Gestionar convenios/CU - Gestionar convenios.docx
@@ -2198,26 +2198,12 @@
                 <w:insideV w:val="single" w:sz="18" w:space="0" w:color="FF0000"/>
               </w:tblBorders>
               <w:tblLayout w:type="fixed"/>
-              <w:tblCellMar>
-                <w:top w:w="0" w:type="dxa"/>
-                <w:left w:w="0" w:type="dxa"/>
-                <w:bottom w:w="0" w:type="dxa"/>
-                <w:right w:w="0" w:type="dxa"/>
-              </w:tblCellMar>
               <w:tblLook w:val="0600" w:firstRow="0" w:lastRow="0" w:firstColumn="0" w:lastColumn="0" w:noHBand="1" w:noVBand="1"/>
             </w:tblPr>
             <w:tblGrid>
               <w:gridCol w:w="4803"/>
             </w:tblGrid>
             <w:tr>
-              <w:tblPrEx>
-                <w:tblCellMar>
-                  <w:top w:w="0" w:type="dxa"/>
-                  <w:left w:w="0" w:type="dxa"/>
-                  <w:bottom w:w="0" w:type="dxa"/>
-                  <w:right w:w="0" w:type="dxa"/>
-                </w:tblCellMar>
-              </w:tblPrEx>
               <w:tc>
                 <w:tcPr>
                   <w:tcW w:w="4803" w:type="dxa"/>
@@ -7333,26 +7319,12 @@
                     <w:insideV w:val="single" w:sz="18" w:space="0" w:color="FF0000"/>
                   </w:tblBorders>
                   <w:tblLayout w:type="fixed"/>
-                  <w:tblCellMar>
-                    <w:top w:w="0" w:type="dxa"/>
-                    <w:left w:w="0" w:type="dxa"/>
-                    <w:bottom w:w="0" w:type="dxa"/>
-                    <w:right w:w="0" w:type="dxa"/>
-                  </w:tblCellMar>
                   <w:tblLook w:val="0600" w:firstRow="0" w:lastRow="0" w:firstColumn="0" w:lastColumn="0" w:noHBand="1" w:noVBand="1"/>
                 </w:tblPr>
                 <w:tblGrid>
                   <w:gridCol w:w="4480"/>
                 </w:tblGrid>
                 <w:tr>
-                  <w:tblPrEx>
-                    <w:tblCellMar>
-                      <w:top w:w="0" w:type="dxa"/>
-                      <w:left w:w="0" w:type="dxa"/>
-                      <w:bottom w:w="0" w:type="dxa"/>
-                      <w:right w:w="0" w:type="dxa"/>
-                    </w:tblCellMar>
-                  </w:tblPrEx>
                   <w:tc>
                     <w:tcPr>
                       <w:tcW w:w="4480" w:type="dxa"/>
@@ -7501,26 +7473,12 @@
                     <w:insideV w:val="single" w:sz="18" w:space="0" w:color="FF0000"/>
                   </w:tblBorders>
                   <w:tblLayout w:type="fixed"/>
-                  <w:tblCellMar>
-                    <w:top w:w="0" w:type="dxa"/>
-                    <w:left w:w="0" w:type="dxa"/>
-                    <w:bottom w:w="0" w:type="dxa"/>
-                    <w:right w:w="0" w:type="dxa"/>
-                  </w:tblCellMar>
                   <w:tblLook w:val="0600" w:firstRow="0" w:lastRow="0" w:firstColumn="0" w:lastColumn="0" w:noHBand="1" w:noVBand="1"/>
                 </w:tblPr>
                 <w:tblGrid>
                   <w:gridCol w:w="4480"/>
                 </w:tblGrid>
                 <w:tr>
-                  <w:tblPrEx>
-                    <w:tblCellMar>
-                      <w:top w:w="0" w:type="dxa"/>
-                      <w:left w:w="0" w:type="dxa"/>
-                      <w:bottom w:w="0" w:type="dxa"/>
-                      <w:right w:w="0" w:type="dxa"/>
-                    </w:tblCellMar>
-                  </w:tblPrEx>
                   <w:tc>
                     <w:tcPr>
                       <w:tcW w:w="4480" w:type="dxa"/>
@@ -9208,26 +9166,12 @@
                     <w:insideV w:val="single" w:sz="18" w:space="0" w:color="FF0000"/>
                   </w:tblBorders>
                   <w:tblLayout w:type="fixed"/>
-                  <w:tblCellMar>
-                    <w:top w:w="0" w:type="dxa"/>
-                    <w:left w:w="0" w:type="dxa"/>
-                    <w:bottom w:w="0" w:type="dxa"/>
-                    <w:right w:w="0" w:type="dxa"/>
-                  </w:tblCellMar>
                   <w:tblLook w:val="0600" w:firstRow="0" w:lastRow="0" w:firstColumn="0" w:lastColumn="0" w:noHBand="1" w:noVBand="1"/>
                 </w:tblPr>
                 <w:tblGrid>
                   <w:gridCol w:w="4480"/>
                 </w:tblGrid>
                 <w:tr>
-                  <w:tblPrEx>
-                    <w:tblCellMar>
-                      <w:top w:w="0" w:type="dxa"/>
-                      <w:left w:w="0" w:type="dxa"/>
-                      <w:bottom w:w="0" w:type="dxa"/>
-                      <w:right w:w="0" w:type="dxa"/>
-                    </w:tblCellMar>
-                  </w:tblPrEx>
                   <w:tc>
                     <w:tcPr>
                       <w:tcW w:w="4480" w:type="dxa"/>
@@ -11125,26 +11069,12 @@
                     <w:insideV w:val="single" w:sz="18" w:space="0" w:color="FF0000"/>
                   </w:tblBorders>
                   <w:tblLayout w:type="fixed"/>
-                  <w:tblCellMar>
-                    <w:top w:w="0" w:type="dxa"/>
-                    <w:left w:w="0" w:type="dxa"/>
-                    <w:bottom w:w="0" w:type="dxa"/>
-                    <w:right w:w="0" w:type="dxa"/>
-                  </w:tblCellMar>
                   <w:tblLook w:val="0600" w:firstRow="0" w:lastRow="0" w:firstColumn="0" w:lastColumn="0" w:noHBand="1" w:noVBand="1"/>
                 </w:tblPr>
                 <w:tblGrid>
                   <w:gridCol w:w="4480"/>
                 </w:tblGrid>
                 <w:tr>
-                  <w:tblPrEx>
-                    <w:tblCellMar>
-                      <w:top w:w="0" w:type="dxa"/>
-                      <w:left w:w="0" w:type="dxa"/>
-                      <w:bottom w:w="0" w:type="dxa"/>
-                      <w:right w:w="0" w:type="dxa"/>
-                    </w:tblCellMar>
-                  </w:tblPrEx>
                   <w:tc>
                     <w:tcPr>
                       <w:tcW w:w="4480" w:type="dxa"/>
@@ -11248,26 +11178,12 @@
                     <w:insideV w:val="single" w:sz="18" w:space="0" w:color="FF0000"/>
                   </w:tblBorders>
                   <w:tblLayout w:type="fixed"/>
-                  <w:tblCellMar>
-                    <w:top w:w="0" w:type="dxa"/>
-                    <w:left w:w="0" w:type="dxa"/>
-                    <w:bottom w:w="0" w:type="dxa"/>
-                    <w:right w:w="0" w:type="dxa"/>
-                  </w:tblCellMar>
                   <w:tblLook w:val="0600" w:firstRow="0" w:lastRow="0" w:firstColumn="0" w:lastColumn="0" w:noHBand="1" w:noVBand="1"/>
                 </w:tblPr>
                 <w:tblGrid>
                   <w:gridCol w:w="4480"/>
                 </w:tblGrid>
                 <w:tr>
-                  <w:tblPrEx>
-                    <w:tblCellMar>
-                      <w:top w:w="0" w:type="dxa"/>
-                      <w:left w:w="0" w:type="dxa"/>
-                      <w:bottom w:w="0" w:type="dxa"/>
-                      <w:right w:w="0" w:type="dxa"/>
-                    </w:tblCellMar>
-                  </w:tblPrEx>
                   <w:tc>
                     <w:tcPr>
                       <w:tcW w:w="4480" w:type="dxa"/>
@@ -12896,26 +12812,12 @@
                     <w:insideV w:val="single" w:sz="18" w:space="0" w:color="FF0000"/>
                   </w:tblBorders>
                   <w:tblLayout w:type="fixed"/>
-                  <w:tblCellMar>
-                    <w:top w:w="0" w:type="dxa"/>
-                    <w:left w:w="0" w:type="dxa"/>
-                    <w:bottom w:w="0" w:type="dxa"/>
-                    <w:right w:w="0" w:type="dxa"/>
-                  </w:tblCellMar>
                   <w:tblLook w:val="0600" w:firstRow="0" w:lastRow="0" w:firstColumn="0" w:lastColumn="0" w:noHBand="1" w:noVBand="1"/>
                 </w:tblPr>
                 <w:tblGrid>
                   <w:gridCol w:w="4480"/>
                 </w:tblGrid>
                 <w:tr>
-                  <w:tblPrEx>
-                    <w:tblCellMar>
-                      <w:top w:w="0" w:type="dxa"/>
-                      <w:left w:w="0" w:type="dxa"/>
-                      <w:bottom w:w="0" w:type="dxa"/>
-                      <w:right w:w="0" w:type="dxa"/>
-                    </w:tblCellMar>
-                  </w:tblPrEx>
                   <w:tc>
                     <w:tcPr>
                       <w:tcW w:w="4480" w:type="dxa"/>
@@ -14794,26 +14696,12 @@
                 <w:insideV w:val="single" w:sz="18" w:space="0" w:color="FF0000"/>
               </w:tblBorders>
               <w:tblLayout w:type="fixed"/>
-              <w:tblCellMar>
-                <w:top w:w="0" w:type="dxa"/>
-                <w:left w:w="0" w:type="dxa"/>
-                <w:bottom w:w="0" w:type="dxa"/>
-                <w:right w:w="0" w:type="dxa"/>
-              </w:tblCellMar>
               <w:tblLook w:val="0600" w:firstRow="0" w:lastRow="0" w:firstColumn="0" w:lastColumn="0" w:noHBand="1" w:noVBand="1"/>
             </w:tblPr>
             <w:tblGrid>
               <w:gridCol w:w="4480"/>
             </w:tblGrid>
             <w:tr>
-              <w:tblPrEx>
-                <w:tblCellMar>
-                  <w:top w:w="0" w:type="dxa"/>
-                  <w:left w:w="0" w:type="dxa"/>
-                  <w:bottom w:w="0" w:type="dxa"/>
-                  <w:right w:w="0" w:type="dxa"/>
-                </w:tblCellMar>
-              </w:tblPrEx>
               <w:tc>
                 <w:tcPr>
                   <w:tcW w:w="4480" w:type="dxa"/>
@@ -14976,26 +14864,12 @@
                 <w:insideV w:val="single" w:sz="18" w:space="0" w:color="FF0000"/>
               </w:tblBorders>
               <w:tblLayout w:type="fixed"/>
-              <w:tblCellMar>
-                <w:top w:w="0" w:type="dxa"/>
-                <w:left w:w="0" w:type="dxa"/>
-                <w:bottom w:w="0" w:type="dxa"/>
-                <w:right w:w="0" w:type="dxa"/>
-              </w:tblCellMar>
               <w:tblLook w:val="0600" w:firstRow="0" w:lastRow="0" w:firstColumn="0" w:lastColumn="0" w:noHBand="1" w:noVBand="1"/>
             </w:tblPr>
             <w:tblGrid>
               <w:gridCol w:w="4480"/>
             </w:tblGrid>
             <w:tr>
-              <w:tblPrEx>
-                <w:tblCellMar>
-                  <w:top w:w="0" w:type="dxa"/>
-                  <w:left w:w="0" w:type="dxa"/>
-                  <w:bottom w:w="0" w:type="dxa"/>
-                  <w:right w:w="0" w:type="dxa"/>
-                </w:tblCellMar>
-              </w:tblPrEx>
               <w:tc>
                 <w:tcPr>
                   <w:tcW w:w="4480" w:type="dxa"/>
@@ -15461,26 +15335,12 @@
                 <w:insideV w:val="single" w:sz="18" w:space="0" w:color="FF0000"/>
               </w:tblBorders>
               <w:tblLayout w:type="fixed"/>
-              <w:tblCellMar>
-                <w:top w:w="0" w:type="dxa"/>
-                <w:left w:w="0" w:type="dxa"/>
-                <w:bottom w:w="0" w:type="dxa"/>
-                <w:right w:w="0" w:type="dxa"/>
-              </w:tblCellMar>
               <w:tblLook w:val="0600" w:firstRow="0" w:lastRow="0" w:firstColumn="0" w:lastColumn="0" w:noHBand="1" w:noVBand="1"/>
             </w:tblPr>
             <w:tblGrid>
               <w:gridCol w:w="4480"/>
             </w:tblGrid>
             <w:tr>
-              <w:tblPrEx>
-                <w:tblCellMar>
-                  <w:top w:w="0" w:type="dxa"/>
-                  <w:left w:w="0" w:type="dxa"/>
-                  <w:bottom w:w="0" w:type="dxa"/>
-                  <w:right w:w="0" w:type="dxa"/>
-                </w:tblCellMar>
-              </w:tblPrEx>
               <w:tc>
                 <w:tcPr>
                   <w:tcW w:w="4480" w:type="dxa"/>
@@ -24792,9 +24652,7 @@
       <w:tblStyleRowBandSize w:val="1"/>
       <w:tblStyleColBandSize w:val="1"/>
       <w:tblCellMar>
-        <w:top w:w="0" w:type="dxa"/>
         <w:left w:w="108" w:type="dxa"/>
-        <w:bottom w:w="0" w:type="dxa"/>
         <w:right w:w="108" w:type="dxa"/>
       </w:tblCellMar>
     </w:tblPr>
@@ -24808,9 +24666,7 @@
       <w:tblStyleRowBandSize w:val="1"/>
       <w:tblStyleColBandSize w:val="1"/>
       <w:tblCellMar>
-        <w:top w:w="0" w:type="dxa"/>
         <w:left w:w="108" w:type="dxa"/>
-        <w:bottom w:w="0" w:type="dxa"/>
         <w:right w:w="108" w:type="dxa"/>
       </w:tblCellMar>
     </w:tblPr>
@@ -24824,9 +24680,7 @@
       <w:tblStyleRowBandSize w:val="1"/>
       <w:tblStyleColBandSize w:val="1"/>
       <w:tblCellMar>
-        <w:top w:w="0" w:type="dxa"/>
         <w:left w:w="108" w:type="dxa"/>
-        <w:bottom w:w="0" w:type="dxa"/>
         <w:right w:w="108" w:type="dxa"/>
       </w:tblCellMar>
     </w:tblPr>
@@ -24840,9 +24694,7 @@
       <w:tblStyleRowBandSize w:val="1"/>
       <w:tblStyleColBandSize w:val="1"/>
       <w:tblCellMar>
-        <w:top w:w="0" w:type="dxa"/>
         <w:left w:w="108" w:type="dxa"/>
-        <w:bottom w:w="0" w:type="dxa"/>
         <w:right w:w="108" w:type="dxa"/>
       </w:tblCellMar>
     </w:tblPr>
@@ -24856,9 +24708,7 @@
       <w:tblStyleRowBandSize w:val="1"/>
       <w:tblStyleColBandSize w:val="1"/>
       <w:tblCellMar>
-        <w:top w:w="0" w:type="dxa"/>
         <w:left w:w="108" w:type="dxa"/>
-        <w:bottom w:w="0" w:type="dxa"/>
         <w:right w:w="108" w:type="dxa"/>
       </w:tblCellMar>
     </w:tblPr>
@@ -24872,9 +24722,7 @@
       <w:tblStyleRowBandSize w:val="1"/>
       <w:tblStyleColBandSize w:val="1"/>
       <w:tblCellMar>
-        <w:top w:w="0" w:type="dxa"/>
         <w:left w:w="108" w:type="dxa"/>
-        <w:bottom w:w="0" w:type="dxa"/>
         <w:right w:w="108" w:type="dxa"/>
       </w:tblCellMar>
     </w:tblPr>
@@ -24888,9 +24736,7 @@
       <w:tblStyleRowBandSize w:val="1"/>
       <w:tblStyleColBandSize w:val="1"/>
       <w:tblCellMar>
-        <w:top w:w="0" w:type="dxa"/>
         <w:left w:w="108" w:type="dxa"/>
-        <w:bottom w:w="0" w:type="dxa"/>
         <w:right w:w="108" w:type="dxa"/>
       </w:tblCellMar>
     </w:tblPr>
@@ -24904,9 +24750,7 @@
       <w:tblStyleRowBandSize w:val="1"/>
       <w:tblStyleColBandSize w:val="1"/>
       <w:tblCellMar>
-        <w:top w:w="0" w:type="dxa"/>
         <w:left w:w="108" w:type="dxa"/>
-        <w:bottom w:w="0" w:type="dxa"/>
         <w:right w:w="108" w:type="dxa"/>
       </w:tblCellMar>
     </w:tblPr>
@@ -24920,9 +24764,7 @@
       <w:tblStyleRowBandSize w:val="1"/>
       <w:tblStyleColBandSize w:val="1"/>
       <w:tblCellMar>
-        <w:top w:w="0" w:type="dxa"/>
         <w:left w:w="108" w:type="dxa"/>
-        <w:bottom w:w="0" w:type="dxa"/>
         <w:right w:w="108" w:type="dxa"/>
       </w:tblCellMar>
     </w:tblPr>
@@ -24936,9 +24778,7 @@
       <w:tblStyleRowBandSize w:val="1"/>
       <w:tblStyleColBandSize w:val="1"/>
       <w:tblCellMar>
-        <w:top w:w="0" w:type="dxa"/>
         <w:left w:w="108" w:type="dxa"/>
-        <w:bottom w:w="0" w:type="dxa"/>
         <w:right w:w="108" w:type="dxa"/>
       </w:tblCellMar>
     </w:tblPr>
@@ -24952,9 +24792,7 @@
       <w:tblStyleRowBandSize w:val="1"/>
       <w:tblStyleColBandSize w:val="1"/>
       <w:tblCellMar>
-        <w:top w:w="0" w:type="dxa"/>
         <w:left w:w="108" w:type="dxa"/>
-        <w:bottom w:w="0" w:type="dxa"/>
         <w:right w:w="108" w:type="dxa"/>
       </w:tblCellMar>
     </w:tblPr>
@@ -24968,9 +24806,7 @@
       <w:tblStyleRowBandSize w:val="1"/>
       <w:tblStyleColBandSize w:val="1"/>
       <w:tblCellMar>
-        <w:top w:w="0" w:type="dxa"/>
         <w:left w:w="108" w:type="dxa"/>
-        <w:bottom w:w="0" w:type="dxa"/>
         <w:right w:w="108" w:type="dxa"/>
       </w:tblCellMar>
     </w:tblPr>
@@ -24984,9 +24820,7 @@
       <w:tblStyleRowBandSize w:val="1"/>
       <w:tblStyleColBandSize w:val="1"/>
       <w:tblCellMar>
-        <w:top w:w="0" w:type="dxa"/>
         <w:left w:w="108" w:type="dxa"/>
-        <w:bottom w:w="0" w:type="dxa"/>
         <w:right w:w="108" w:type="dxa"/>
       </w:tblCellMar>
     </w:tblPr>
@@ -25000,9 +24834,7 @@
       <w:tblStyleRowBandSize w:val="1"/>
       <w:tblStyleColBandSize w:val="1"/>
       <w:tblCellMar>
-        <w:top w:w="0" w:type="dxa"/>
         <w:left w:w="108" w:type="dxa"/>
-        <w:bottom w:w="0" w:type="dxa"/>
         <w:right w:w="108" w:type="dxa"/>
       </w:tblCellMar>
     </w:tblPr>
@@ -25016,9 +24848,7 @@
       <w:tblStyleRowBandSize w:val="1"/>
       <w:tblStyleColBandSize w:val="1"/>
       <w:tblCellMar>
-        <w:top w:w="0" w:type="dxa"/>
         <w:left w:w="108" w:type="dxa"/>
-        <w:bottom w:w="0" w:type="dxa"/>
         <w:right w:w="108" w:type="dxa"/>
       </w:tblCellMar>
     </w:tblPr>
@@ -25032,9 +24862,7 @@
       <w:tblStyleRowBandSize w:val="1"/>
       <w:tblStyleColBandSize w:val="1"/>
       <w:tblCellMar>
-        <w:top w:w="0" w:type="dxa"/>
         <w:left w:w="108" w:type="dxa"/>
-        <w:bottom w:w="0" w:type="dxa"/>
         <w:right w:w="108" w:type="dxa"/>
       </w:tblCellMar>
     </w:tblPr>
@@ -25048,9 +24876,7 @@
       <w:tblStyleRowBandSize w:val="1"/>
       <w:tblStyleColBandSize w:val="1"/>
       <w:tblCellMar>
-        <w:top w:w="0" w:type="dxa"/>
         <w:left w:w="108" w:type="dxa"/>
-        <w:bottom w:w="0" w:type="dxa"/>
         <w:right w:w="108" w:type="dxa"/>
       </w:tblCellMar>
     </w:tblPr>
@@ -25064,9 +24890,7 @@
       <w:tblStyleRowBandSize w:val="1"/>
       <w:tblStyleColBandSize w:val="1"/>
       <w:tblCellMar>
-        <w:top w:w="0" w:type="dxa"/>
         <w:left w:w="108" w:type="dxa"/>
-        <w:bottom w:w="0" w:type="dxa"/>
         <w:right w:w="108" w:type="dxa"/>
       </w:tblCellMar>
     </w:tblPr>
@@ -25080,9 +24904,7 @@
       <w:tblStyleRowBandSize w:val="1"/>
       <w:tblStyleColBandSize w:val="1"/>
       <w:tblCellMar>
-        <w:top w:w="0" w:type="dxa"/>
         <w:left w:w="108" w:type="dxa"/>
-        <w:bottom w:w="0" w:type="dxa"/>
         <w:right w:w="108" w:type="dxa"/>
       </w:tblCellMar>
     </w:tblPr>
@@ -25096,9 +24918,7 @@
       <w:tblStyleRowBandSize w:val="1"/>
       <w:tblStyleColBandSize w:val="1"/>
       <w:tblCellMar>
-        <w:top w:w="0" w:type="dxa"/>
         <w:left w:w="108" w:type="dxa"/>
-        <w:bottom w:w="0" w:type="dxa"/>
         <w:right w:w="108" w:type="dxa"/>
       </w:tblCellMar>
     </w:tblPr>
@@ -25112,9 +24932,7 @@
       <w:tblStyleRowBandSize w:val="1"/>
       <w:tblStyleColBandSize w:val="1"/>
       <w:tblCellMar>
-        <w:top w:w="0" w:type="dxa"/>
         <w:left w:w="108" w:type="dxa"/>
-        <w:bottom w:w="0" w:type="dxa"/>
         <w:right w:w="108" w:type="dxa"/>
       </w:tblCellMar>
     </w:tblPr>
@@ -25128,9 +24946,7 @@
       <w:tblStyleRowBandSize w:val="1"/>
       <w:tblStyleColBandSize w:val="1"/>
       <w:tblCellMar>
-        <w:top w:w="0" w:type="dxa"/>
         <w:left w:w="108" w:type="dxa"/>
-        <w:bottom w:w="0" w:type="dxa"/>
         <w:right w:w="108" w:type="dxa"/>
       </w:tblCellMar>
     </w:tblPr>
@@ -25144,9 +24960,7 @@
       <w:tblStyleRowBandSize w:val="1"/>
       <w:tblStyleColBandSize w:val="1"/>
       <w:tblCellMar>
-        <w:top w:w="0" w:type="dxa"/>
         <w:left w:w="108" w:type="dxa"/>
-        <w:bottom w:w="0" w:type="dxa"/>
         <w:right w:w="108" w:type="dxa"/>
       </w:tblCellMar>
     </w:tblPr>
@@ -25160,9 +24974,7 @@
       <w:tblStyleRowBandSize w:val="1"/>
       <w:tblStyleColBandSize w:val="1"/>
       <w:tblCellMar>
-        <w:top w:w="0" w:type="dxa"/>
         <w:left w:w="108" w:type="dxa"/>
-        <w:bottom w:w="0" w:type="dxa"/>
         <w:right w:w="108" w:type="dxa"/>
       </w:tblCellMar>
     </w:tblPr>
@@ -25176,9 +24988,7 @@
       <w:tblStyleRowBandSize w:val="1"/>
       <w:tblStyleColBandSize w:val="1"/>
       <w:tblCellMar>
-        <w:top w:w="0" w:type="dxa"/>
         <w:left w:w="108" w:type="dxa"/>
-        <w:bottom w:w="0" w:type="dxa"/>
         <w:right w:w="108" w:type="dxa"/>
       </w:tblCellMar>
     </w:tblPr>
@@ -25192,9 +25002,7 @@
       <w:tblStyleRowBandSize w:val="1"/>
       <w:tblStyleColBandSize w:val="1"/>
       <w:tblCellMar>
-        <w:top w:w="0" w:type="dxa"/>
         <w:left w:w="108" w:type="dxa"/>
-        <w:bottom w:w="0" w:type="dxa"/>
         <w:right w:w="108" w:type="dxa"/>
       </w:tblCellMar>
     </w:tblPr>
@@ -25208,9 +25016,7 @@
       <w:tblStyleRowBandSize w:val="1"/>
       <w:tblStyleColBandSize w:val="1"/>
       <w:tblCellMar>
-        <w:top w:w="0" w:type="dxa"/>
         <w:left w:w="108" w:type="dxa"/>
-        <w:bottom w:w="0" w:type="dxa"/>
         <w:right w:w="108" w:type="dxa"/>
       </w:tblCellMar>
     </w:tblPr>
@@ -25224,9 +25030,7 @@
       <w:tblStyleRowBandSize w:val="1"/>
       <w:tblStyleColBandSize w:val="1"/>
       <w:tblCellMar>
-        <w:top w:w="0" w:type="dxa"/>
         <w:left w:w="108" w:type="dxa"/>
-        <w:bottom w:w="0" w:type="dxa"/>
         <w:right w:w="108" w:type="dxa"/>
       </w:tblCellMar>
     </w:tblPr>
@@ -25240,9 +25044,7 @@
       <w:tblStyleRowBandSize w:val="1"/>
       <w:tblStyleColBandSize w:val="1"/>
       <w:tblCellMar>
-        <w:top w:w="0" w:type="dxa"/>
         <w:left w:w="108" w:type="dxa"/>
-        <w:bottom w:w="0" w:type="dxa"/>
         <w:right w:w="108" w:type="dxa"/>
       </w:tblCellMar>
     </w:tblPr>
@@ -25256,9 +25058,7 @@
       <w:tblStyleRowBandSize w:val="1"/>
       <w:tblStyleColBandSize w:val="1"/>
       <w:tblCellMar>
-        <w:top w:w="0" w:type="dxa"/>
         <w:left w:w="108" w:type="dxa"/>
-        <w:bottom w:w="0" w:type="dxa"/>
         <w:right w:w="108" w:type="dxa"/>
       </w:tblCellMar>
     </w:tblPr>
@@ -25272,9 +25072,7 @@
       <w:tblStyleRowBandSize w:val="1"/>
       <w:tblStyleColBandSize w:val="1"/>
       <w:tblCellMar>
-        <w:top w:w="0" w:type="dxa"/>
         <w:left w:w="108" w:type="dxa"/>
-        <w:bottom w:w="0" w:type="dxa"/>
         <w:right w:w="108" w:type="dxa"/>
       </w:tblCellMar>
     </w:tblPr>
@@ -25288,9 +25086,7 @@
       <w:tblStyleRowBandSize w:val="1"/>
       <w:tblStyleColBandSize w:val="1"/>
       <w:tblCellMar>
-        <w:top w:w="0" w:type="dxa"/>
         <w:left w:w="108" w:type="dxa"/>
-        <w:bottom w:w="0" w:type="dxa"/>
         <w:right w:w="108" w:type="dxa"/>
       </w:tblCellMar>
     </w:tblPr>
@@ -25304,9 +25100,7 @@
       <w:tblStyleRowBandSize w:val="1"/>
       <w:tblStyleColBandSize w:val="1"/>
       <w:tblCellMar>
-        <w:top w:w="0" w:type="dxa"/>
         <w:left w:w="108" w:type="dxa"/>
-        <w:bottom w:w="0" w:type="dxa"/>
         <w:right w:w="108" w:type="dxa"/>
       </w:tblCellMar>
     </w:tblPr>
@@ -25320,9 +25114,7 @@
       <w:tblStyleRowBandSize w:val="1"/>
       <w:tblStyleColBandSize w:val="1"/>
       <w:tblCellMar>
-        <w:top w:w="0" w:type="dxa"/>
         <w:left w:w="108" w:type="dxa"/>
-        <w:bottom w:w="0" w:type="dxa"/>
         <w:right w:w="108" w:type="dxa"/>
       </w:tblCellMar>
     </w:tblPr>
@@ -25336,9 +25128,7 @@
       <w:tblStyleRowBandSize w:val="1"/>
       <w:tblStyleColBandSize w:val="1"/>
       <w:tblCellMar>
-        <w:top w:w="0" w:type="dxa"/>
         <w:left w:w="108" w:type="dxa"/>
-        <w:bottom w:w="0" w:type="dxa"/>
         <w:right w:w="108" w:type="dxa"/>
       </w:tblCellMar>
     </w:tblPr>
@@ -25352,9 +25142,7 @@
       <w:tblStyleRowBandSize w:val="1"/>
       <w:tblStyleColBandSize w:val="1"/>
       <w:tblCellMar>
-        <w:top w:w="0" w:type="dxa"/>
         <w:left w:w="108" w:type="dxa"/>
-        <w:bottom w:w="0" w:type="dxa"/>
         <w:right w:w="108" w:type="dxa"/>
       </w:tblCellMar>
     </w:tblPr>
@@ -25368,9 +25156,7 @@
       <w:tblStyleRowBandSize w:val="1"/>
       <w:tblStyleColBandSize w:val="1"/>
       <w:tblCellMar>
-        <w:top w:w="0" w:type="dxa"/>
         <w:left w:w="108" w:type="dxa"/>
-        <w:bottom w:w="0" w:type="dxa"/>
         <w:right w:w="108" w:type="dxa"/>
       </w:tblCellMar>
     </w:tblPr>
@@ -25380,12 +25166,6 @@
     <w:tblPr>
       <w:tblStyleRowBandSize w:val="1"/>
       <w:tblStyleColBandSize w:val="1"/>
-      <w:tblCellMar>
-        <w:top w:w="0" w:type="dxa"/>
-        <w:left w:w="0" w:type="dxa"/>
-        <w:bottom w:w="0" w:type="dxa"/>
-        <w:right w:w="0" w:type="dxa"/>
-      </w:tblCellMar>
     </w:tblPr>
   </w:style>
   <w:style w:type="table" w:customStyle="1" w:styleId="aff5">
@@ -25397,9 +25177,7 @@
       <w:tblStyleRowBandSize w:val="1"/>
       <w:tblStyleColBandSize w:val="1"/>
       <w:tblCellMar>
-        <w:top w:w="0" w:type="dxa"/>
         <w:left w:w="108" w:type="dxa"/>
-        <w:bottom w:w="0" w:type="dxa"/>
         <w:right w:w="108" w:type="dxa"/>
       </w:tblCellMar>
     </w:tblPr>
@@ -25413,9 +25191,7 @@
       <w:tblStyleRowBandSize w:val="1"/>
       <w:tblStyleColBandSize w:val="1"/>
       <w:tblCellMar>
-        <w:top w:w="0" w:type="dxa"/>
         <w:left w:w="108" w:type="dxa"/>
-        <w:bottom w:w="0" w:type="dxa"/>
         <w:right w:w="108" w:type="dxa"/>
       </w:tblCellMar>
     </w:tblPr>
@@ -25429,9 +25205,7 @@
       <w:tblStyleRowBandSize w:val="1"/>
       <w:tblStyleColBandSize w:val="1"/>
       <w:tblCellMar>
-        <w:top w:w="0" w:type="dxa"/>
         <w:left w:w="108" w:type="dxa"/>
-        <w:bottom w:w="0" w:type="dxa"/>
         <w:right w:w="108" w:type="dxa"/>
       </w:tblCellMar>
     </w:tblPr>
@@ -25445,9 +25219,7 @@
       <w:tblStyleRowBandSize w:val="1"/>
       <w:tblStyleColBandSize w:val="1"/>
       <w:tblCellMar>
-        <w:top w:w="0" w:type="dxa"/>
         <w:left w:w="108" w:type="dxa"/>
-        <w:bottom w:w="0" w:type="dxa"/>
         <w:right w:w="108" w:type="dxa"/>
       </w:tblCellMar>
     </w:tblPr>
@@ -25461,9 +25233,7 @@
       <w:tblStyleRowBandSize w:val="1"/>
       <w:tblStyleColBandSize w:val="1"/>
       <w:tblCellMar>
-        <w:top w:w="0" w:type="dxa"/>
         <w:left w:w="108" w:type="dxa"/>
-        <w:bottom w:w="0" w:type="dxa"/>
         <w:right w:w="108" w:type="dxa"/>
       </w:tblCellMar>
     </w:tblPr>
@@ -25477,9 +25247,7 @@
       <w:tblStyleRowBandSize w:val="1"/>
       <w:tblStyleColBandSize w:val="1"/>
       <w:tblCellMar>
-        <w:top w:w="0" w:type="dxa"/>
         <w:left w:w="108" w:type="dxa"/>
-        <w:bottom w:w="0" w:type="dxa"/>
         <w:right w:w="108" w:type="dxa"/>
       </w:tblCellMar>
     </w:tblPr>
@@ -25493,9 +25261,7 @@
       <w:tblStyleRowBandSize w:val="1"/>
       <w:tblStyleColBandSize w:val="1"/>
       <w:tblCellMar>
-        <w:top w:w="0" w:type="dxa"/>
         <w:left w:w="108" w:type="dxa"/>
-        <w:bottom w:w="0" w:type="dxa"/>
         <w:right w:w="108" w:type="dxa"/>
       </w:tblCellMar>
     </w:tblPr>
@@ -25509,9 +25275,7 @@
       <w:tblStyleRowBandSize w:val="1"/>
       <w:tblStyleColBandSize w:val="1"/>
       <w:tblCellMar>
-        <w:top w:w="0" w:type="dxa"/>
         <w:left w:w="108" w:type="dxa"/>
-        <w:bottom w:w="0" w:type="dxa"/>
         <w:right w:w="108" w:type="dxa"/>
       </w:tblCellMar>
     </w:tblPr>
@@ -25525,9 +25289,7 @@
       <w:tblStyleRowBandSize w:val="1"/>
       <w:tblStyleColBandSize w:val="1"/>
       <w:tblCellMar>
-        <w:top w:w="0" w:type="dxa"/>
         <w:left w:w="108" w:type="dxa"/>
-        <w:bottom w:w="0" w:type="dxa"/>
         <w:right w:w="108" w:type="dxa"/>
       </w:tblCellMar>
     </w:tblPr>
@@ -25541,9 +25303,7 @@
       <w:tblStyleRowBandSize w:val="1"/>
       <w:tblStyleColBandSize w:val="1"/>
       <w:tblCellMar>
-        <w:top w:w="0" w:type="dxa"/>
         <w:left w:w="108" w:type="dxa"/>
-        <w:bottom w:w="0" w:type="dxa"/>
         <w:right w:w="108" w:type="dxa"/>
       </w:tblCellMar>
     </w:tblPr>
@@ -25553,12 +25313,6 @@
     <w:tblPr>
       <w:tblStyleRowBandSize w:val="1"/>
       <w:tblStyleColBandSize w:val="1"/>
-      <w:tblCellMar>
-        <w:top w:w="0" w:type="dxa"/>
-        <w:left w:w="0" w:type="dxa"/>
-        <w:bottom w:w="0" w:type="dxa"/>
-        <w:right w:w="0" w:type="dxa"/>
-      </w:tblCellMar>
     </w:tblPr>
   </w:style>
   <w:style w:type="table" w:customStyle="1" w:styleId="afff0">
@@ -25566,12 +25320,6 @@
     <w:tblPr>
       <w:tblStyleRowBandSize w:val="1"/>
       <w:tblStyleColBandSize w:val="1"/>
-      <w:tblCellMar>
-        <w:top w:w="0" w:type="dxa"/>
-        <w:left w:w="0" w:type="dxa"/>
-        <w:bottom w:w="0" w:type="dxa"/>
-        <w:right w:w="0" w:type="dxa"/>
-      </w:tblCellMar>
     </w:tblPr>
   </w:style>
   <w:style w:type="table" w:customStyle="1" w:styleId="afff1">
@@ -25583,9 +25331,7 @@
       <w:tblStyleRowBandSize w:val="1"/>
       <w:tblStyleColBandSize w:val="1"/>
       <w:tblCellMar>
-        <w:top w:w="0" w:type="dxa"/>
         <w:left w:w="108" w:type="dxa"/>
-        <w:bottom w:w="0" w:type="dxa"/>
         <w:right w:w="108" w:type="dxa"/>
       </w:tblCellMar>
     </w:tblPr>
@@ -25599,9 +25345,7 @@
       <w:tblStyleRowBandSize w:val="1"/>
       <w:tblStyleColBandSize w:val="1"/>
       <w:tblCellMar>
-        <w:top w:w="0" w:type="dxa"/>
         <w:left w:w="108" w:type="dxa"/>
-        <w:bottom w:w="0" w:type="dxa"/>
         <w:right w:w="108" w:type="dxa"/>
       </w:tblCellMar>
     </w:tblPr>
@@ -25615,9 +25359,7 @@
       <w:tblStyleRowBandSize w:val="1"/>
       <w:tblStyleColBandSize w:val="1"/>
       <w:tblCellMar>
-        <w:top w:w="0" w:type="dxa"/>
         <w:left w:w="108" w:type="dxa"/>
-        <w:bottom w:w="0" w:type="dxa"/>
         <w:right w:w="108" w:type="dxa"/>
       </w:tblCellMar>
     </w:tblPr>
@@ -25631,9 +25373,7 @@
       <w:tblStyleRowBandSize w:val="1"/>
       <w:tblStyleColBandSize w:val="1"/>
       <w:tblCellMar>
-        <w:top w:w="0" w:type="dxa"/>
         <w:left w:w="108" w:type="dxa"/>
-        <w:bottom w:w="0" w:type="dxa"/>
         <w:right w:w="108" w:type="dxa"/>
       </w:tblCellMar>
     </w:tblPr>
@@ -25643,12 +25383,6 @@
     <w:tblPr>
       <w:tblStyleRowBandSize w:val="1"/>
       <w:tblStyleColBandSize w:val="1"/>
-      <w:tblCellMar>
-        <w:top w:w="0" w:type="dxa"/>
-        <w:left w:w="0" w:type="dxa"/>
-        <w:bottom w:w="0" w:type="dxa"/>
-        <w:right w:w="0" w:type="dxa"/>
-      </w:tblCellMar>
     </w:tblPr>
   </w:style>
   <w:style w:type="table" w:customStyle="1" w:styleId="afff6">
@@ -25660,9 +25394,7 @@
       <w:tblStyleRowBandSize w:val="1"/>
       <w:tblStyleColBandSize w:val="1"/>
       <w:tblCellMar>
-        <w:top w:w="0" w:type="dxa"/>
         <w:left w:w="108" w:type="dxa"/>
-        <w:bottom w:w="0" w:type="dxa"/>
         <w:right w:w="108" w:type="dxa"/>
       </w:tblCellMar>
     </w:tblPr>
@@ -25676,9 +25408,7 @@
       <w:tblStyleRowBandSize w:val="1"/>
       <w:tblStyleColBandSize w:val="1"/>
       <w:tblCellMar>
-        <w:top w:w="0" w:type="dxa"/>
         <w:left w:w="108" w:type="dxa"/>
-        <w:bottom w:w="0" w:type="dxa"/>
         <w:right w:w="108" w:type="dxa"/>
       </w:tblCellMar>
     </w:tblPr>
@@ -25692,9 +25422,7 @@
       <w:tblStyleRowBandSize w:val="1"/>
       <w:tblStyleColBandSize w:val="1"/>
       <w:tblCellMar>
-        <w:top w:w="0" w:type="dxa"/>
         <w:left w:w="108" w:type="dxa"/>
-        <w:bottom w:w="0" w:type="dxa"/>
         <w:right w:w="108" w:type="dxa"/>
       </w:tblCellMar>
     </w:tblPr>
@@ -25708,9 +25436,7 @@
       <w:tblStyleRowBandSize w:val="1"/>
       <w:tblStyleColBandSize w:val="1"/>
       <w:tblCellMar>
-        <w:top w:w="0" w:type="dxa"/>
         <w:left w:w="108" w:type="dxa"/>
-        <w:bottom w:w="0" w:type="dxa"/>
         <w:right w:w="108" w:type="dxa"/>
       </w:tblCellMar>
     </w:tblPr>
@@ -25720,12 +25446,6 @@
     <w:tblPr>
       <w:tblStyleRowBandSize w:val="1"/>
       <w:tblStyleColBandSize w:val="1"/>
-      <w:tblCellMar>
-        <w:top w:w="0" w:type="dxa"/>
-        <w:left w:w="0" w:type="dxa"/>
-        <w:bottom w:w="0" w:type="dxa"/>
-        <w:right w:w="0" w:type="dxa"/>
-      </w:tblCellMar>
     </w:tblPr>
   </w:style>
   <w:style w:type="table" w:customStyle="1" w:styleId="afffb">
@@ -25733,12 +25453,6 @@
     <w:tblPr>
       <w:tblStyleRowBandSize w:val="1"/>
       <w:tblStyleColBandSize w:val="1"/>
-      <w:tblCellMar>
-        <w:top w:w="0" w:type="dxa"/>
-        <w:left w:w="0" w:type="dxa"/>
-        <w:bottom w:w="0" w:type="dxa"/>
-        <w:right w:w="0" w:type="dxa"/>
-      </w:tblCellMar>
     </w:tblPr>
   </w:style>
   <w:style w:type="table" w:customStyle="1" w:styleId="afffc">
@@ -25750,9 +25464,7 @@
       <w:tblStyleRowBandSize w:val="1"/>
       <w:tblStyleColBandSize w:val="1"/>
       <w:tblCellMar>
-        <w:top w:w="0" w:type="dxa"/>
         <w:left w:w="108" w:type="dxa"/>
-        <w:bottom w:w="0" w:type="dxa"/>
         <w:right w:w="108" w:type="dxa"/>
       </w:tblCellMar>
     </w:tblPr>
@@ -25766,9 +25478,7 @@
       <w:tblStyleRowBandSize w:val="1"/>
       <w:tblStyleColBandSize w:val="1"/>
       <w:tblCellMar>
-        <w:top w:w="0" w:type="dxa"/>
         <w:left w:w="108" w:type="dxa"/>
-        <w:bottom w:w="0" w:type="dxa"/>
         <w:right w:w="108" w:type="dxa"/>
       </w:tblCellMar>
     </w:tblPr>
@@ -25782,9 +25492,7 @@
       <w:tblStyleRowBandSize w:val="1"/>
       <w:tblStyleColBandSize w:val="1"/>
       <w:tblCellMar>
-        <w:top w:w="0" w:type="dxa"/>
         <w:left w:w="108" w:type="dxa"/>
-        <w:bottom w:w="0" w:type="dxa"/>
         <w:right w:w="108" w:type="dxa"/>
       </w:tblCellMar>
     </w:tblPr>
@@ -25798,9 +25506,7 @@
       <w:tblStyleRowBandSize w:val="1"/>
       <w:tblStyleColBandSize w:val="1"/>
       <w:tblCellMar>
-        <w:top w:w="0" w:type="dxa"/>
         <w:left w:w="108" w:type="dxa"/>
-        <w:bottom w:w="0" w:type="dxa"/>
         <w:right w:w="108" w:type="dxa"/>
       </w:tblCellMar>
     </w:tblPr>
@@ -25810,12 +25516,6 @@
     <w:tblPr>
       <w:tblStyleRowBandSize w:val="1"/>
       <w:tblStyleColBandSize w:val="1"/>
-      <w:tblCellMar>
-        <w:top w:w="0" w:type="dxa"/>
-        <w:left w:w="0" w:type="dxa"/>
-        <w:bottom w:w="0" w:type="dxa"/>
-        <w:right w:w="0" w:type="dxa"/>
-      </w:tblCellMar>
     </w:tblPr>
   </w:style>
   <w:style w:type="table" w:customStyle="1" w:styleId="affff1">
@@ -25827,9 +25527,7 @@
       <w:tblStyleRowBandSize w:val="1"/>
       <w:tblStyleColBandSize w:val="1"/>
       <w:tblCellMar>
-        <w:top w:w="0" w:type="dxa"/>
         <w:left w:w="108" w:type="dxa"/>
-        <w:bottom w:w="0" w:type="dxa"/>
         <w:right w:w="108" w:type="dxa"/>
       </w:tblCellMar>
     </w:tblPr>
@@ -25843,9 +25541,7 @@
       <w:tblStyleRowBandSize w:val="1"/>
       <w:tblStyleColBandSize w:val="1"/>
       <w:tblCellMar>
-        <w:top w:w="0" w:type="dxa"/>
         <w:left w:w="108" w:type="dxa"/>
-        <w:bottom w:w="0" w:type="dxa"/>
         <w:right w:w="108" w:type="dxa"/>
       </w:tblCellMar>
     </w:tblPr>
@@ -25859,9 +25555,7 @@
       <w:tblStyleRowBandSize w:val="1"/>
       <w:tblStyleColBandSize w:val="1"/>
       <w:tblCellMar>
-        <w:top w:w="0" w:type="dxa"/>
         <w:left w:w="108" w:type="dxa"/>
-        <w:bottom w:w="0" w:type="dxa"/>
         <w:right w:w="108" w:type="dxa"/>
       </w:tblCellMar>
     </w:tblPr>
@@ -25871,12 +25565,6 @@
     <w:tblPr>
       <w:tblStyleRowBandSize w:val="1"/>
       <w:tblStyleColBandSize w:val="1"/>
-      <w:tblCellMar>
-        <w:top w:w="0" w:type="dxa"/>
-        <w:left w:w="0" w:type="dxa"/>
-        <w:bottom w:w="0" w:type="dxa"/>
-        <w:right w:w="0" w:type="dxa"/>
-      </w:tblCellMar>
     </w:tblPr>
   </w:style>
   <w:style w:type="table" w:customStyle="1" w:styleId="affff5">
@@ -25884,12 +25572,6 @@
     <w:tblPr>
       <w:tblStyleRowBandSize w:val="1"/>
       <w:tblStyleColBandSize w:val="1"/>
-      <w:tblCellMar>
-        <w:top w:w="0" w:type="dxa"/>
-        <w:left w:w="0" w:type="dxa"/>
-        <w:bottom w:w="0" w:type="dxa"/>
-        <w:right w:w="0" w:type="dxa"/>
-      </w:tblCellMar>
     </w:tblPr>
   </w:style>
   <w:style w:type="table" w:customStyle="1" w:styleId="affff6">
@@ -25897,12 +25579,6 @@
     <w:tblPr>
       <w:tblStyleRowBandSize w:val="1"/>
       <w:tblStyleColBandSize w:val="1"/>
-      <w:tblCellMar>
-        <w:top w:w="0" w:type="dxa"/>
-        <w:left w:w="0" w:type="dxa"/>
-        <w:bottom w:w="0" w:type="dxa"/>
-        <w:right w:w="0" w:type="dxa"/>
-      </w:tblCellMar>
     </w:tblPr>
   </w:style>
   <w:style w:type="table" w:customStyle="1" w:styleId="affff7">
@@ -25914,9 +25590,7 @@
       <w:tblStyleRowBandSize w:val="1"/>
       <w:tblStyleColBandSize w:val="1"/>
       <w:tblCellMar>
-        <w:top w:w="0" w:type="dxa"/>
         <w:left w:w="108" w:type="dxa"/>
-        <w:bottom w:w="0" w:type="dxa"/>
         <w:right w:w="108" w:type="dxa"/>
       </w:tblCellMar>
     </w:tblPr>
@@ -25930,9 +25604,7 @@
       <w:tblStyleRowBandSize w:val="1"/>
       <w:tblStyleColBandSize w:val="1"/>
       <w:tblCellMar>
-        <w:top w:w="0" w:type="dxa"/>
         <w:left w:w="108" w:type="dxa"/>
-        <w:bottom w:w="0" w:type="dxa"/>
         <w:right w:w="108" w:type="dxa"/>
       </w:tblCellMar>
     </w:tblPr>
@@ -25946,9 +25618,7 @@
       <w:tblStyleRowBandSize w:val="1"/>
       <w:tblStyleColBandSize w:val="1"/>
       <w:tblCellMar>
-        <w:top w:w="0" w:type="dxa"/>
         <w:left w:w="108" w:type="dxa"/>
-        <w:bottom w:w="0" w:type="dxa"/>
         <w:right w:w="108" w:type="dxa"/>
       </w:tblCellMar>
     </w:tblPr>
@@ -25962,9 +25632,7 @@
       <w:tblStyleRowBandSize w:val="1"/>
       <w:tblStyleColBandSize w:val="1"/>
       <w:tblCellMar>
-        <w:top w:w="0" w:type="dxa"/>
         <w:left w:w="108" w:type="dxa"/>
-        <w:bottom w:w="0" w:type="dxa"/>
         <w:right w:w="108" w:type="dxa"/>
       </w:tblCellMar>
     </w:tblPr>
@@ -25978,9 +25646,7 @@
       <w:tblStyleRowBandSize w:val="1"/>
       <w:tblStyleColBandSize w:val="1"/>
       <w:tblCellMar>
-        <w:top w:w="0" w:type="dxa"/>
         <w:left w:w="108" w:type="dxa"/>
-        <w:bottom w:w="0" w:type="dxa"/>
         <w:right w:w="108" w:type="dxa"/>
       </w:tblCellMar>
     </w:tblPr>
@@ -25994,9 +25660,7 @@
       <w:tblStyleRowBandSize w:val="1"/>
       <w:tblStyleColBandSize w:val="1"/>
       <w:tblCellMar>
-        <w:top w:w="0" w:type="dxa"/>
         <w:left w:w="108" w:type="dxa"/>
-        <w:bottom w:w="0" w:type="dxa"/>
         <w:right w:w="108" w:type="dxa"/>
       </w:tblCellMar>
     </w:tblPr>
@@ -26010,9 +25674,7 @@
       <w:tblStyleRowBandSize w:val="1"/>
       <w:tblStyleColBandSize w:val="1"/>
       <w:tblCellMar>
-        <w:top w:w="0" w:type="dxa"/>
         <w:left w:w="108" w:type="dxa"/>
-        <w:bottom w:w="0" w:type="dxa"/>
         <w:right w:w="108" w:type="dxa"/>
       </w:tblCellMar>
     </w:tblPr>
@@ -26026,9 +25688,7 @@
       <w:tblStyleRowBandSize w:val="1"/>
       <w:tblStyleColBandSize w:val="1"/>
       <w:tblCellMar>
-        <w:top w:w="0" w:type="dxa"/>
         <w:left w:w="108" w:type="dxa"/>
-        <w:bottom w:w="0" w:type="dxa"/>
         <w:right w:w="108" w:type="dxa"/>
       </w:tblCellMar>
     </w:tblPr>
@@ -26042,9 +25702,7 @@
       <w:tblStyleRowBandSize w:val="1"/>
       <w:tblStyleColBandSize w:val="1"/>
       <w:tblCellMar>
-        <w:top w:w="0" w:type="dxa"/>
         <w:left w:w="108" w:type="dxa"/>
-        <w:bottom w:w="0" w:type="dxa"/>
         <w:right w:w="108" w:type="dxa"/>
       </w:tblCellMar>
     </w:tblPr>
@@ -26058,9 +25716,7 @@
       <w:tblStyleRowBandSize w:val="1"/>
       <w:tblStyleColBandSize w:val="1"/>
       <w:tblCellMar>
-        <w:top w:w="0" w:type="dxa"/>
         <w:left w:w="108" w:type="dxa"/>
-        <w:bottom w:w="0" w:type="dxa"/>
         <w:right w:w="108" w:type="dxa"/>
       </w:tblCellMar>
     </w:tblPr>
@@ -26074,9 +25730,7 @@
       <w:tblStyleRowBandSize w:val="1"/>
       <w:tblStyleColBandSize w:val="1"/>
       <w:tblCellMar>
-        <w:top w:w="0" w:type="dxa"/>
         <w:left w:w="108" w:type="dxa"/>
-        <w:bottom w:w="0" w:type="dxa"/>
         <w:right w:w="108" w:type="dxa"/>
       </w:tblCellMar>
     </w:tblPr>
@@ -26090,9 +25744,7 @@
       <w:tblStyleRowBandSize w:val="1"/>
       <w:tblStyleColBandSize w:val="1"/>
       <w:tblCellMar>
-        <w:top w:w="0" w:type="dxa"/>
         <w:left w:w="108" w:type="dxa"/>
-        <w:bottom w:w="0" w:type="dxa"/>
         <w:right w:w="108" w:type="dxa"/>
       </w:tblCellMar>
     </w:tblPr>
@@ -26106,9 +25758,7 @@
       <w:tblStyleRowBandSize w:val="1"/>
       <w:tblStyleColBandSize w:val="1"/>
       <w:tblCellMar>
-        <w:top w:w="0" w:type="dxa"/>
         <w:left w:w="108" w:type="dxa"/>
-        <w:bottom w:w="0" w:type="dxa"/>
         <w:right w:w="108" w:type="dxa"/>
       </w:tblCellMar>
     </w:tblPr>
@@ -26122,9 +25772,7 @@
       <w:tblStyleRowBandSize w:val="1"/>
       <w:tblStyleColBandSize w:val="1"/>
       <w:tblCellMar>
-        <w:top w:w="0" w:type="dxa"/>
         <w:left w:w="108" w:type="dxa"/>
-        <w:bottom w:w="0" w:type="dxa"/>
         <w:right w:w="108" w:type="dxa"/>
       </w:tblCellMar>
     </w:tblPr>
@@ -26138,9 +25786,7 @@
       <w:tblStyleRowBandSize w:val="1"/>
       <w:tblStyleColBandSize w:val="1"/>
       <w:tblCellMar>
-        <w:top w:w="0" w:type="dxa"/>
         <w:left w:w="108" w:type="dxa"/>
-        <w:bottom w:w="0" w:type="dxa"/>
         <w:right w:w="108" w:type="dxa"/>
       </w:tblCellMar>
     </w:tblPr>

</xml_diff>